<commit_message>
Updated with Penn State/Johns Hopkins research
</commit_message>
<xml_diff>
--- a/Documents/Pinpoint_Selected_Bibliography.docx
+++ b/Documents/Pinpoint_Selected_Bibliography.docx
@@ -656,6 +656,227 @@
         <w:pStyle w:val="Heading1"/>
       </w:pPr>
       <w:r>
+        <w:t>Additional Penn State and Johns Hopkins sources</w:t>
+      </w:r>
+    </w:p>
+    <w:p>
+      <w:pPr>
+        <w:keepNext/>
+        <w:keepLines/>
+        <w:spacing w:after="20"/>
+        <w:ind w:left="461" w:hanging="461"/>
+      </w:pPr>
+      <w:r>
+        <w:t xml:space="preserve">Andress, S., Johnson, A., Unberath, M., Winkler, A. F., Yu, K., Fotouhi, J., Weidert, S., Osgood, G., &amp; Navab, N. (2018). On-the-fly augmented reality for orthopedic surgery using a multimodal fiducial. Journal of Medical Imaging, 5(2), Article 021209. </w:t>
+      </w:r>
+      <w:hyperlink r:id="rId26">
+        <w:r>
+          <w:rPr>
+            <w:color w:val="0563C1"/>
+            <w:u w:val="single"/>
+          </w:rPr>
+          <w:t>https://doi.org/10.1117/1.JMI.5.2.021209</w:t>
+        </w:r>
+      </w:hyperlink>
+    </w:p>
+    <w:p>
+      <w:pPr>
+        <w:keepLines/>
+        <w:spacing w:after="140"/>
+        <w:ind w:left="461"/>
+      </w:pPr>
+      <w:r>
+        <w:rPr>
+          <w:b w:val="0"/>
+          <w:i/>
+        </w:rPr>
+        <w:t xml:space="preserve">Relevance to Pinpoint: </w:t>
+      </w:r>
+      <w:r>
+        <w:rPr>
+          <w:b w:val="0"/>
+          <w:i/>
+        </w:rPr>
+        <w:t>Johns Hopkins-affiliated AR research combining a multimodality fiducial with SLAM-based co-calibration and quantitative evaluation. The medical application differs from shipbuilding, but the registration, alignment, annotation, and evaluation concepts are directly useful for defining Pinpoint spatial-anchoring benchmarks.</w:t>
+      </w:r>
+    </w:p>
+    <w:p>
+      <w:pPr>
+        <w:keepNext/>
+        <w:keepLines/>
+        <w:spacing w:after="20"/>
+        <w:ind w:left="461" w:hanging="461"/>
+      </w:pPr>
+      <w:r>
+        <w:t xml:space="preserve">Estadt, E. J., Nguyen, K., Skinner, K., Negahban, A., Ashour, O., &amp; Ozden, S. G. (2024). Warehouse Augmented Reality Program (WARP): A web tool for warehouse design and operation education. In 2024 ASEE Annual Conference &amp; Exposition. </w:t>
+      </w:r>
+      <w:hyperlink r:id="rId27">
+        <w:r>
+          <w:rPr>
+            <w:color w:val="0563C1"/>
+            <w:u w:val="single"/>
+          </w:rPr>
+          <w:t>https://peer.asee.org/48262.pdf</w:t>
+        </w:r>
+      </w:hyperlink>
+    </w:p>
+    <w:p>
+      <w:pPr>
+        <w:keepLines/>
+        <w:spacing w:after="140"/>
+        <w:ind w:left="461"/>
+      </w:pPr>
+      <w:r>
+        <w:rPr>
+          <w:b w:val="0"/>
+          <w:i/>
+        </w:rPr>
+        <w:t xml:space="preserve">Relevance to Pinpoint: </w:t>
+      </w:r>
+      <w:r>
+        <w:rPr>
+          <w:b w:val="0"/>
+          <w:i/>
+        </w:rPr>
+        <w:t>Penn State work on a WebXR AR tool for warehouse design and operations. It is an adjacent industrial example for lightweight, mobile AR visualization and user-facing workflow design; it is less directly applicable to persistent spatial notes or field knowledge capture.</w:t>
+      </w:r>
+    </w:p>
+    <w:p>
+      <w:pPr>
+        <w:keepNext/>
+        <w:keepLines/>
+        <w:spacing w:after="20"/>
+        <w:ind w:left="461" w:hanging="461"/>
+      </w:pPr>
+      <w:r>
+        <w:t xml:space="preserve">Ghorbani, Z., Ayer, S. K., &amp; Messner, J. I. (2025). A taxonomy for augmented reality use cases in the AECO industry. Construction Innovation, 26(4), 1072-1096. </w:t>
+      </w:r>
+      <w:hyperlink r:id="rId28">
+        <w:r>
+          <w:rPr>
+            <w:color w:val="0563C1"/>
+            <w:u w:val="single"/>
+          </w:rPr>
+          <w:t>https://doi.org/10.1108/CI-07-2024-0211</w:t>
+        </w:r>
+      </w:hyperlink>
+    </w:p>
+    <w:p>
+      <w:pPr>
+        <w:keepLines/>
+        <w:spacing w:after="140"/>
+        <w:ind w:left="461"/>
+      </w:pPr>
+      <w:r>
+        <w:rPr>
+          <w:b w:val="0"/>
+          <w:i/>
+        </w:rPr>
+        <w:t xml:space="preserve">Relevance to Pinpoint: </w:t>
+      </w:r>
+      <w:r>
+        <w:rPr>
+          <w:b w:val="0"/>
+          <w:i/>
+        </w:rPr>
+        <w:t>Penn State-led peer-reviewed taxonomy based on 315 AECO AR use cases. Useful for defining Pinpoint in a disciplined way across application context, collaboration, interaction, content positioning, and augmentation purpose.</w:t>
+      </w:r>
+    </w:p>
+    <w:p>
+      <w:pPr>
+        <w:keepNext/>
+        <w:keepLines/>
+        <w:spacing w:after="20"/>
+        <w:ind w:left="461" w:hanging="461"/>
+      </w:pPr>
+      <w:r>
+        <w:t xml:space="preserve">Xie, J., Yu, R., Lee, S., Lyu, Y., Billah, S. M., &amp; Carroll, J. M. (2022). Helping helpers: Supporting volunteers in remote sighted assistance with augmented reality maps. In Designing Interactive Systems Conference 2022 (pp. 881-897). ACM. </w:t>
+      </w:r>
+      <w:hyperlink r:id="rId29">
+        <w:r>
+          <w:rPr>
+            <w:color w:val="0563C1"/>
+            <w:u w:val="single"/>
+          </w:rPr>
+          <w:t>https://doi.org/10.1145/3532106.3533560</w:t>
+        </w:r>
+      </w:hyperlink>
+    </w:p>
+    <w:p>
+      <w:pPr>
+        <w:keepLines/>
+        <w:spacing w:after="140"/>
+        <w:ind w:left="461"/>
+      </w:pPr>
+      <w:r>
+        <w:rPr>
+          <w:b w:val="0"/>
+          <w:i/>
+        </w:rPr>
+        <w:t xml:space="preserve">Relevance to Pinpoint: </w:t>
+      </w:r>
+      <w:r>
+        <w:rPr>
+          <w:b w:val="0"/>
+          <w:i/>
+        </w:rPr>
+        <w:t>Penn State research with a controlled comparison of AR-map support against a baseline workflow. Particularly useful as a model for Pinpoint evaluation measures: task time, cognitive workload, remote collaboration, orientation, and the usability impact of spatial context.</w:t>
+      </w:r>
+    </w:p>
+    <w:p>
+      <w:pPr>
+        <w:pStyle w:val="Heading2"/>
+      </w:pPr>
+      <w:r>
+        <w:t>Supplementary institutional context (non-peer-reviewed)</w:t>
+      </w:r>
+    </w:p>
+    <w:p>
+      <w:pPr>
+        <w:keepNext/>
+        <w:keepLines/>
+        <w:spacing w:after="20"/>
+        <w:ind w:left="461" w:hanging="461"/>
+      </w:pPr>
+      <w:r>
+        <w:t xml:space="preserve">Johns Hopkins Applied Physics Laboratory. (2021, September 24). Johns Hopkins APL's augmented reality toolbox helps Army multi-domain defense. </w:t>
+      </w:r>
+      <w:hyperlink r:id="rId30">
+        <w:r>
+          <w:rPr>
+            <w:color w:val="0563C1"/>
+            <w:u w:val="single"/>
+          </w:rPr>
+          <w:t>https://www.jhuapl.edu/news/news-releases/210924-augmented-reality-boosts-army-multi-domain-defense</w:t>
+        </w:r>
+      </w:hyperlink>
+    </w:p>
+    <w:p>
+      <w:pPr>
+        <w:keepLines/>
+        <w:spacing w:after="140"/>
+        <w:ind w:left="461"/>
+      </w:pPr>
+      <w:r>
+        <w:rPr>
+          <w:b w:val="0"/>
+          <w:i/>
+        </w:rPr>
+        <w:t xml:space="preserve">Relevance to Pinpoint: </w:t>
+      </w:r>
+      <w:r>
+        <w:rPr>
+          <w:b w:val="0"/>
+          <w:i/>
+        </w:rPr>
+        <w:t>Public technical context rather than a peer-reviewed study. The JADOTS/ArmourX description is relevant to Pinpoint's broader chain of spatially contextualized data, shared situational understanding, and decision support in a complex operational environment.</w:t>
+      </w:r>
+    </w:p>
+    <w:p>
+      <w:pPr>
+        <w:pStyle w:val="Heading1"/>
+      </w:pPr>
+      <w:r>
         <w:t>Project context (internal source)</w:t>
       </w:r>
     </w:p>
@@ -721,6 +942,22 @@
       </w:pPr>
       <w:r>
         <w:t>6. Saka et al. (2024) - LLM opportunity and risk framing for a construction-adjacent industrial workflow.</w:t>
+      </w:r>
+    </w:p>
+    <w:p>
+      <w:pPr>
+        <w:ind w:left="317" w:hanging="259"/>
+      </w:pPr>
+      <w:r>
+        <w:t>7. Ghorbani et al. (2025) and Xie et al. (2022) - use-case taxonomy and a concrete evaluation model for AR-supported work.</w:t>
+      </w:r>
+    </w:p>
+    <w:p>
+      <w:pPr>
+        <w:ind w:left="317" w:hanging="259"/>
+      </w:pPr>
+      <w:r>
+        <w:t>8. Andress et al. (2018) - benchmark inspiration for registration, alignment, and quantitative spatial-accuracy testing.</w:t>
       </w:r>
     </w:p>
     <w:sectPr>

</xml_diff>